<commit_message>
docs: record the v1.2.5 release-signing defect
Section 15 documents the defect that only appeared when a published artifact was installed
over an existing install: INSTALL_FAILED_UPDATE_INCOMPATIBLE, because release builds were
signed with Gradle's on-demand debug keystore and every CI runner therefore produced a
different certificate. No release could ever update the previous one.

It also records why four mechanisms missed it - unit tests never install, CI builds but never
installs, the audits are read-only, and the field test installed a locally built APK after an
uninstall. And it names the gap in this document's own method: section 6 verified that the
build works on the device, but against a locally built binary; "the release artifact works on
the device" is a different claim that had never been checked.

Verification recorded: published v1.2.5 and a local build now share certificate d1c16028...,
and installing the local build over the published one succeeds.
</commit_message>
<xml_diff>
--- a/docs/GEMINI_CONSOLIDATED_REVIEW.docx
+++ b/docs/GEMINI_CONSOLIDATED_REVIEW.docx
@@ -1086,7 +1086,7 @@
               <w:rPr>
                 <w:sz w:val="18"/>
               </w:rPr>
-              <w:t xml:space="preserve"> at </w:t>
+              <w:t xml:space="preserve"> at the </w:t>
             </w:r>
             <w:r>
               <w:rPr>
@@ -1094,13 +1094,13 @@
                 <w:color w:val="1F2328"/>
                 <w:sz w:val="18"/>
               </w:rPr>
-              <w:t>aa19108</w:t>
-            </w:r>
-            <w:r>
-              <w:rPr>
-                <w:sz w:val="18"/>
-              </w:rPr>
-              <w:t xml:space="preserve"> / tag </w:t>
+              <w:t>v1.2.5</w:t>
+            </w:r>
+            <w:r>
+              <w:rPr>
+                <w:sz w:val="18"/>
+              </w:rPr>
+              <w:t xml:space="preserve"> merge / tag </w:t>
             </w:r>
             <w:r>
               <w:rPr>
@@ -1108,7 +1108,7 @@
                 <w:color w:val="1F2328"/>
                 <w:sz w:val="18"/>
               </w:rPr>
-              <w:t>v1.2.4</w:t>
+              <w:t>v1.2.5</w:t>
             </w:r>
           </w:p>
         </w:tc>
@@ -1778,6 +1778,102 @@
           </w:p>
         </w:tc>
       </w:tr>
+      <w:tr>
+        <w:tc>
+          <w:tcPr>
+            <w:tcW w:type="dxa" w:w="1728"/>
+          </w:tcPr>
+          <w:p>
+            <w:r>
+              <w:rPr>
+                <w:sz w:val="18"/>
+              </w:rPr>
+            </w:r>
+            <w:r>
+              <w:rPr>
+                <w:rFonts w:ascii="Consolas" w:hAnsi="Consolas"/>
+                <w:color w:val="1F2328"/>
+                <w:sz w:val="18"/>
+              </w:rPr>
+              <w:t>v1.2.5</w:t>
+            </w:r>
+          </w:p>
+        </w:tc>
+        <w:tc>
+          <w:tcPr>
+            <w:tcW w:type="dxa" w:w="1728"/>
+          </w:tcPr>
+          <w:p>
+            <w:r>
+              <w:rPr>
+                <w:sz w:val="18"/>
+              </w:rPr>
+            </w:r>
+            <w:r>
+              <w:rPr>
+                <w:rFonts w:ascii="Consolas" w:hAnsi="Consolas"/>
+                <w:color w:val="1F2328"/>
+                <w:sz w:val="18"/>
+              </w:rPr>
+              <w:t>0da58e9</w:t>
+            </w:r>
+          </w:p>
+        </w:tc>
+        <w:tc>
+          <w:tcPr>
+            <w:tcW w:type="dxa" w:w="1728"/>
+          </w:tcPr>
+          <w:p>
+            <w:r>
+              <w:rPr>
+                <w:sz w:val="18"/>
+              </w:rPr>
+            </w:r>
+            <w:r>
+              <w:rPr>
+                <w:sz w:val="18"/>
+              </w:rPr>
+              <w:t>2026-10-17 10:34</w:t>
+            </w:r>
+          </w:p>
+        </w:tc>
+        <w:tc>
+          <w:tcPr>
+            <w:tcW w:type="dxa" w:w="1728"/>
+          </w:tcPr>
+          <w:p>
+            <w:r>
+              <w:rPr>
+                <w:sz w:val="18"/>
+              </w:rPr>
+            </w:r>
+            <w:r>
+              <w:rPr>
+                <w:sz w:val="18"/>
+              </w:rPr>
+              <w:t>see release</w:t>
+            </w:r>
+          </w:p>
+        </w:tc>
+        <w:tc>
+          <w:tcPr>
+            <w:tcW w:type="dxa" w:w="1728"/>
+          </w:tcPr>
+          <w:p>
+            <w:r>
+              <w:rPr>
+                <w:sz w:val="18"/>
+              </w:rPr>
+            </w:r>
+            <w:r>
+              <w:rPr>
+                <w:sz w:val="18"/>
+              </w:rPr>
+              <w:t>130</w:t>
+            </w:r>
+          </w:p>
+        </w:tc>
+      </w:tr>
     </w:tbl>
     <w:p/>
     <w:p>
@@ -1881,7 +1977,7 @@
     </w:p>
     <w:p>
       <w:r>
-        <w:t xml:space="preserve">54 tracked files, 1,364,775 bytes, 20,360 lines (reproducible via </w:t>
+        <w:t xml:space="preserve">56 tracked files, 1,375,665 bytes, 20,472 lines (reproducible via </w:t>
       </w:r>
       <w:r>
         <w:rPr>
@@ -8704,6 +8800,729 @@
       </w:r>
       <w:r>
         <w:t xml:space="preserve"> incident in §5.2.</w:t>
+      </w:r>
+    </w:p>
+    <w:p>
+      <w:pPr>
+        <w:jc w:val="center"/>
+      </w:pPr>
+      <w:r>
+        <w:rPr>
+          <w:color w:val="888888"/>
+          <w:sz w:val="18"/>
+        </w:rPr>
+        <w:t>• • •</w:t>
+      </w:r>
+    </w:p>
+    <w:p>
+      <w:pPr>
+        <w:pStyle w:val="Heading1"/>
+      </w:pPr>
+      <w:r>
+        <w:t>15. `v1.2.5` — a release-pipeline defect found only by installing a release</w:t>
+      </w:r>
+    </w:p>
+    <w:p>
+      <w:r>
+        <w:t xml:space="preserve">This round began as bookkeeping — deploy the published </w:t>
+      </w:r>
+      <w:r>
+        <w:rPr>
+          <w:rFonts w:ascii="Consolas" w:hAnsi="Consolas"/>
+          <w:color w:val="1F2328"/>
+          <w:sz w:val="18"/>
+        </w:rPr>
+        <w:t>v1.2.4</w:t>
+      </w:r>
+      <w:r>
+        <w:t xml:space="preserve"> to the phone so the device</w:t>
+      </w:r>
+    </w:p>
+    <w:p>
+      <w:r>
+        <w:t>matched the artifact — and immediately failed:</w:t>
+      </w:r>
+    </w:p>
+    <w:p>
+      <w:pPr>
+        <w:spacing w:after="200"/>
+        <w:ind w:left="280"/>
+      </w:pPr>
+      <w:r>
+        <w:rPr>
+          <w:rFonts w:ascii="Consolas" w:hAnsi="Consolas"/>
+          <w:color w:val="1F2328"/>
+          <w:sz w:val="17"/>
+        </w:rPr>
+        <w:t>adb: failed to install app-release.apk: Failure</w:t>
+        <w:br/>
+        <w:t>[INSTALL_FAILED_UPDATE_INCOMPATIBLE: Existing package com.bridge.applewatch</w:t>
+        <w:br/>
+        <w:t xml:space="preserve"> signatures do not match newer version; ignoring!]</w:t>
+      </w:r>
+    </w:p>
+    <w:p>
+      <w:pPr>
+        <w:pStyle w:val="Heading2"/>
+      </w:pPr>
+      <w:r>
+        <w:t>15.1 Root cause</w:t>
+      </w:r>
+    </w:p>
+    <w:p>
+      <w:r>
+        <w:t xml:space="preserve">The </w:t>
+      </w:r>
+      <w:r>
+        <w:rPr>
+          <w:rFonts w:ascii="Consolas" w:hAnsi="Consolas"/>
+          <w:color w:val="1F2328"/>
+          <w:sz w:val="18"/>
+        </w:rPr>
+        <w:t>release</w:t>
+      </w:r>
+      <w:r>
+        <w:t xml:space="preserve"> build type was signed with </w:t>
+      </w:r>
+      <w:r>
+        <w:rPr>
+          <w:rFonts w:ascii="Consolas" w:hAnsi="Consolas"/>
+          <w:color w:val="1F2328"/>
+          <w:sz w:val="18"/>
+        </w:rPr>
+        <w:t>signingConfigs.getByName("debug")</w:t>
+      </w:r>
+      <w:r>
+        <w:t>. **Gradle</w:t>
+      </w:r>
+    </w:p>
+    <w:p>
+      <w:r>
+        <w:t>generates a debug keystore on demand**, so every CI runner produced its own key. Three</w:t>
+      </w:r>
+    </w:p>
+    <w:p>
+      <w:r>
+        <w:t>distinct certificates were measured:</w:t>
+      </w:r>
+    </w:p>
+    <w:tbl>
+      <w:tblPr>
+        <w:tblStyle w:val="TableGrid"/>
+        <w:tblW w:type="auto" w:w="0"/>
+        <w:tblLook w:firstColumn="1" w:firstRow="1" w:lastColumn="0" w:lastRow="0" w:noHBand="0" w:noVBand="1" w:val="04A0"/>
+      </w:tblPr>
+      <w:tblGrid>
+        <w:gridCol w:w="4320"/>
+        <w:gridCol w:w="4320"/>
+      </w:tblGrid>
+      <w:tr>
+        <w:tc>
+          <w:tcPr>
+            <w:tcW w:type="dxa" w:w="4320"/>
+          </w:tcPr>
+          <w:p>
+            <w:r>
+              <w:rPr>
+                <w:b/>
+                <w:sz w:val="18"/>
+              </w:rPr>
+            </w:r>
+            <w:r>
+              <w:rPr>
+                <w:b/>
+                <w:sz w:val="18"/>
+              </w:rPr>
+              <w:t>Build</w:t>
+            </w:r>
+          </w:p>
+        </w:tc>
+        <w:tc>
+          <w:tcPr>
+            <w:tcW w:type="dxa" w:w="4320"/>
+          </w:tcPr>
+          <w:p>
+            <w:r>
+              <w:rPr>
+                <w:b/>
+                <w:sz w:val="18"/>
+              </w:rPr>
+            </w:r>
+            <w:r>
+              <w:rPr>
+                <w:b/>
+                <w:sz w:val="18"/>
+              </w:rPr>
+              <w:t>Certificate SHA-256</w:t>
+            </w:r>
+          </w:p>
+        </w:tc>
+      </w:tr>
+      <w:tr>
+        <w:tc>
+          <w:tcPr>
+            <w:tcW w:type="dxa" w:w="4320"/>
+          </w:tcPr>
+          <w:p>
+            <w:r>
+              <w:rPr>
+                <w:sz w:val="18"/>
+              </w:rPr>
+            </w:r>
+            <w:r>
+              <w:rPr>
+                <w:rFonts w:ascii="Consolas" w:hAnsi="Consolas"/>
+                <w:color w:val="1F2328"/>
+                <w:sz w:val="18"/>
+              </w:rPr>
+              <w:t>v1.2.3</w:t>
+            </w:r>
+            <w:r>
+              <w:rPr>
+                <w:sz w:val="18"/>
+              </w:rPr>
+              <w:t xml:space="preserve"> (published)</w:t>
+            </w:r>
+          </w:p>
+        </w:tc>
+        <w:tc>
+          <w:tcPr>
+            <w:tcW w:type="dxa" w:w="4320"/>
+          </w:tcPr>
+          <w:p>
+            <w:r>
+              <w:rPr>
+                <w:sz w:val="18"/>
+              </w:rPr>
+            </w:r>
+            <w:r>
+              <w:rPr>
+                <w:rFonts w:ascii="Consolas" w:hAnsi="Consolas"/>
+                <w:color w:val="1F2328"/>
+                <w:sz w:val="18"/>
+              </w:rPr>
+              <w:t>f7dbfda60e79d1470f5ebdd71e88d7e367b2c49ce4b8b8fafd5fcca4931ba476</w:t>
+            </w:r>
+          </w:p>
+        </w:tc>
+      </w:tr>
+      <w:tr>
+        <w:tc>
+          <w:tcPr>
+            <w:tcW w:type="dxa" w:w="4320"/>
+          </w:tcPr>
+          <w:p>
+            <w:r>
+              <w:rPr>
+                <w:sz w:val="18"/>
+              </w:rPr>
+            </w:r>
+            <w:r>
+              <w:rPr>
+                <w:rFonts w:ascii="Consolas" w:hAnsi="Consolas"/>
+                <w:color w:val="1F2328"/>
+                <w:sz w:val="18"/>
+              </w:rPr>
+              <w:t>v1.2.4</w:t>
+            </w:r>
+            <w:r>
+              <w:rPr>
+                <w:sz w:val="18"/>
+              </w:rPr>
+              <w:t xml:space="preserve"> (published)</w:t>
+            </w:r>
+          </w:p>
+        </w:tc>
+        <w:tc>
+          <w:tcPr>
+            <w:tcW w:type="dxa" w:w="4320"/>
+          </w:tcPr>
+          <w:p>
+            <w:r>
+              <w:rPr>
+                <w:sz w:val="18"/>
+              </w:rPr>
+            </w:r>
+            <w:r>
+              <w:rPr>
+                <w:rFonts w:ascii="Consolas" w:hAnsi="Consolas"/>
+                <w:color w:val="1F2328"/>
+                <w:sz w:val="18"/>
+              </w:rPr>
+              <w:t>42a41c9428a4654e95d29c8cd8348dd783f7b1942ab6131da7c973671c63069c</w:t>
+            </w:r>
+          </w:p>
+        </w:tc>
+      </w:tr>
+      <w:tr>
+        <w:tc>
+          <w:tcPr>
+            <w:tcW w:type="dxa" w:w="4320"/>
+          </w:tcPr>
+          <w:p>
+            <w:r>
+              <w:rPr>
+                <w:sz w:val="18"/>
+              </w:rPr>
+            </w:r>
+            <w:r>
+              <w:rPr>
+                <w:sz w:val="18"/>
+              </w:rPr>
+              <w:t>local build</w:t>
+            </w:r>
+          </w:p>
+        </w:tc>
+        <w:tc>
+          <w:tcPr>
+            <w:tcW w:type="dxa" w:w="4320"/>
+          </w:tcPr>
+          <w:p>
+            <w:r>
+              <w:rPr>
+                <w:sz w:val="18"/>
+              </w:rPr>
+            </w:r>
+            <w:r>
+              <w:rPr>
+                <w:rFonts w:ascii="Consolas" w:hAnsi="Consolas"/>
+                <w:color w:val="1F2328"/>
+                <w:sz w:val="18"/>
+              </w:rPr>
+              <w:t>62ef7742e35e742a94a071bba83631fd6db78b5b50961f7b45719d736500d7b5</w:t>
+            </w:r>
+          </w:p>
+        </w:tc>
+      </w:tr>
+    </w:tbl>
+    <w:p/>
+    <w:p>
+      <w:r>
+        <w:t xml:space="preserve">Consequence: </w:t>
+      </w:r>
+      <w:r>
+        <w:rPr>
+          <w:b/>
+        </w:rPr>
+        <w:t>no release could ever update the previous one.</w:t>
+      </w:r>
+      <w:r>
+        <w:t xml:space="preserve"> Every upgrade required an</w:t>
+      </w:r>
+    </w:p>
+    <w:p>
+      <w:r>
+        <w:t>uninstall, which discards the bridge token and the persisted step baseline.</w:t>
+      </w:r>
+    </w:p>
+    <w:p>
+      <w:pPr>
+        <w:pStyle w:val="Heading2"/>
+      </w:pPr>
+      <w:r>
+        <w:t>15.2 Why four mechanisms missed it</w:t>
+      </w:r>
+    </w:p>
+    <w:tbl>
+      <w:tblPr>
+        <w:tblStyle w:val="TableGrid"/>
+        <w:tblW w:type="auto" w:w="0"/>
+        <w:tblLook w:firstColumn="1" w:firstRow="1" w:lastColumn="0" w:lastRow="0" w:noHBand="0" w:noVBand="1" w:val="04A0"/>
+      </w:tblPr>
+      <w:tblGrid>
+        <w:gridCol w:w="4320"/>
+        <w:gridCol w:w="4320"/>
+      </w:tblGrid>
+      <w:tr>
+        <w:tc>
+          <w:tcPr>
+            <w:tcW w:type="dxa" w:w="4320"/>
+          </w:tcPr>
+          <w:p>
+            <w:r>
+              <w:rPr>
+                <w:b/>
+                <w:sz w:val="18"/>
+              </w:rPr>
+            </w:r>
+            <w:r>
+              <w:rPr>
+                <w:b/>
+                <w:sz w:val="18"/>
+              </w:rPr>
+              <w:t>Mechanism</w:t>
+            </w:r>
+          </w:p>
+        </w:tc>
+        <w:tc>
+          <w:tcPr>
+            <w:tcW w:type="dxa" w:w="4320"/>
+          </w:tcPr>
+          <w:p>
+            <w:r>
+              <w:rPr>
+                <w:b/>
+                <w:sz w:val="18"/>
+              </w:rPr>
+            </w:r>
+            <w:r>
+              <w:rPr>
+                <w:b/>
+                <w:sz w:val="18"/>
+              </w:rPr>
+              <w:t>Why not</w:t>
+            </w:r>
+          </w:p>
+        </w:tc>
+      </w:tr>
+      <w:tr>
+        <w:tc>
+          <w:tcPr>
+            <w:tcW w:type="dxa" w:w="4320"/>
+          </w:tcPr>
+          <w:p>
+            <w:r>
+              <w:rPr>
+                <w:sz w:val="18"/>
+              </w:rPr>
+            </w:r>
+            <w:r>
+              <w:rPr>
+                <w:sz w:val="18"/>
+              </w:rPr>
+              <w:t>Unit tests</w:t>
+            </w:r>
+          </w:p>
+        </w:tc>
+        <w:tc>
+          <w:tcPr>
+            <w:tcW w:type="dxa" w:w="4320"/>
+          </w:tcPr>
+          <w:p>
+            <w:r>
+              <w:rPr>
+                <w:sz w:val="18"/>
+              </w:rPr>
+            </w:r>
+            <w:r>
+              <w:rPr>
+                <w:sz w:val="18"/>
+              </w:rPr>
+              <w:t>Never install anything</w:t>
+            </w:r>
+          </w:p>
+        </w:tc>
+      </w:tr>
+      <w:tr>
+        <w:tc>
+          <w:tcPr>
+            <w:tcW w:type="dxa" w:w="4320"/>
+          </w:tcPr>
+          <w:p>
+            <w:r>
+              <w:rPr>
+                <w:sz w:val="18"/>
+              </w:rPr>
+            </w:r>
+            <w:r>
+              <w:rPr>
+                <w:sz w:val="18"/>
+              </w:rPr>
+              <w:t>CI</w:t>
+            </w:r>
+          </w:p>
+        </w:tc>
+        <w:tc>
+          <w:tcPr>
+            <w:tcW w:type="dxa" w:w="4320"/>
+          </w:tcPr>
+          <w:p>
+            <w:r>
+              <w:rPr>
+                <w:sz w:val="18"/>
+              </w:rPr>
+            </w:r>
+            <w:r>
+              <w:rPr>
+                <w:sz w:val="18"/>
+              </w:rPr>
+              <w:t>Builds both APKs and uploads them, but never installs one over another</w:t>
+            </w:r>
+          </w:p>
+        </w:tc>
+      </w:tr>
+      <w:tr>
+        <w:tc>
+          <w:tcPr>
+            <w:tcW w:type="dxa" w:w="4320"/>
+          </w:tcPr>
+          <w:p>
+            <w:r>
+              <w:rPr>
+                <w:sz w:val="18"/>
+              </w:rPr>
+            </w:r>
+            <w:r>
+              <w:rPr>
+                <w:sz w:val="18"/>
+              </w:rPr>
+              <w:t>Three adversarial audits</w:t>
+            </w:r>
+          </w:p>
+        </w:tc>
+        <w:tc>
+          <w:tcPr>
+            <w:tcW w:type="dxa" w:w="4320"/>
+          </w:tcPr>
+          <w:p>
+            <w:r>
+              <w:rPr>
+                <w:sz w:val="18"/>
+              </w:rPr>
+            </w:r>
+            <w:r>
+              <w:rPr>
+                <w:sz w:val="18"/>
+              </w:rPr>
+              <w:t>Read-only; no artifact is ever signed or installed</w:t>
+            </w:r>
+          </w:p>
+        </w:tc>
+      </w:tr>
+      <w:tr>
+        <w:tc>
+          <w:tcPr>
+            <w:tcW w:type="dxa" w:w="4320"/>
+          </w:tcPr>
+          <w:p>
+            <w:r>
+              <w:rPr>
+                <w:sz w:val="18"/>
+              </w:rPr>
+            </w:r>
+            <w:r>
+              <w:rPr>
+                <w:sz w:val="18"/>
+              </w:rPr>
+              <w:t>Field test (§6)</w:t>
+            </w:r>
+          </w:p>
+        </w:tc>
+        <w:tc>
+          <w:tcPr>
+            <w:tcW w:type="dxa" w:w="4320"/>
+          </w:tcPr>
+          <w:p>
+            <w:r>
+              <w:rPr>
+                <w:sz w:val="18"/>
+              </w:rPr>
+            </w:r>
+            <w:r>
+              <w:rPr>
+                <w:sz w:val="18"/>
+              </w:rPr>
+              <w:t xml:space="preserve">Installed a </w:t>
+            </w:r>
+            <w:r>
+              <w:rPr>
+                <w:b/>
+                <w:sz w:val="18"/>
+              </w:rPr>
+              <w:t>locally built</w:t>
+            </w:r>
+            <w:r>
+              <w:rPr>
+                <w:sz w:val="18"/>
+              </w:rPr>
+              <w:t xml:space="preserve"> APK, not a published one — and always after an uninstall, so a signature mismatch could not surface</w:t>
+            </w:r>
+          </w:p>
+        </w:tc>
+      </w:tr>
+    </w:tbl>
+    <w:p/>
+    <w:p>
+      <w:r>
+        <w:t>The only thing that could find it was **installing a published artifact over an existing</w:t>
+      </w:r>
+    </w:p>
+    <w:p>
+      <w:r>
+        <w:t>install**. That step had never been performed in four releases.</w:t>
+      </w:r>
+    </w:p>
+    <w:p>
+      <w:r>
+        <w:t>It also exposes a gap in this document's own method: §6 verified behaviour on the device, but</w:t>
+      </w:r>
+    </w:p>
+    <w:p>
+      <w:r>
+        <w:t>verified it against a locally built binary. "It works on the device" and "the release artifact</w:t>
+      </w:r>
+    </w:p>
+    <w:p>
+      <w:r>
+        <w:t>works on the device" are different claims, and only the first had been checked.</w:t>
+      </w:r>
+    </w:p>
+    <w:p>
+      <w:pPr>
+        <w:pStyle w:val="Heading2"/>
+      </w:pPr>
+      <w:r>
+        <w:t>15.3 Fix</w:t>
+      </w:r>
+    </w:p>
+    <w:p>
+      <w:r>
+        <w:t>A fixed, repository-committed sideload key (</w:t>
+      </w:r>
+      <w:r>
+        <w:rPr>
+          <w:rFonts w:ascii="Consolas" w:hAnsi="Consolas"/>
+          <w:color w:val="1F2328"/>
+          <w:sz w:val="18"/>
+        </w:rPr>
+        <w:t>ci/sideload.keystore</w:t>
+      </w:r>
+      <w:r>
+        <w:t xml:space="preserve">), used by CI </w:t>
+      </w:r>
+      <w:r>
+        <w:rPr>
+          <w:b/>
+        </w:rPr>
+        <w:t>and</w:t>
+      </w:r>
+      <w:r>
+        <w:t xml:space="preserve"> local</w:t>
+      </w:r>
+    </w:p>
+    <w:p>
+      <w:r>
+        <w:t xml:space="preserve">builds, password documented because the key is public, with </w:t>
+      </w:r>
+      <w:r>
+        <w:rPr>
+          <w:rFonts w:ascii="Consolas" w:hAnsi="Consolas"/>
+          <w:color w:val="1F2328"/>
+          <w:sz w:val="18"/>
+        </w:rPr>
+        <w:t>ci/README.md</w:t>
+      </w:r>
+      <w:r>
+        <w:t xml:space="preserve"> stating that it must</w:t>
+      </w:r>
+    </w:p>
+    <w:p>
+      <w:r>
+        <w:t>never be used for a Play upload and that rotating it means no installed build will upgrade</w:t>
+      </w:r>
+    </w:p>
+    <w:p>
+      <w:r>
+        <w:t xml:space="preserve">again. Bumped to </w:t>
+      </w:r>
+      <w:r>
+        <w:rPr>
+          <w:rFonts w:ascii="Consolas" w:hAnsi="Consolas"/>
+          <w:color w:val="1F2328"/>
+          <w:sz w:val="18"/>
+        </w:rPr>
+        <w:t>v1.2.5</w:t>
+      </w:r>
+      <w:r>
+        <w:t xml:space="preserve"> / </w:t>
+      </w:r>
+      <w:r>
+        <w:rPr>
+          <w:rFonts w:ascii="Consolas" w:hAnsi="Consolas"/>
+          <w:color w:val="1F2328"/>
+          <w:sz w:val="18"/>
+        </w:rPr>
+        <w:t>versionCode 10</w:t>
+      </w:r>
+      <w:r>
+        <w:t>.</w:t>
+      </w:r>
+    </w:p>
+    <w:p>
+      <w:pPr>
+        <w:pStyle w:val="Heading2"/>
+      </w:pPr>
+      <w:r>
+        <w:t>15.4 Verification</w:t>
+      </w:r>
+    </w:p>
+    <w:p>
+      <w:pPr>
+        <w:spacing w:after="200"/>
+        <w:ind w:left="280"/>
+      </w:pPr>
+      <w:r>
+        <w:rPr>
+          <w:rFonts w:ascii="Consolas" w:hAnsi="Consolas"/>
+          <w:color w:val="1F2328"/>
+          <w:sz w:val="17"/>
+        </w:rPr>
+        <w:t>CI-published v1.2.5 certificate : d1c1602825393a180791b78c17f27f3cee8cd41a32597512260ac3648e528101</w:t>
+        <w:br/>
+        <w:t>local build certificate         : d1c1602825393a180791b78c17f27f3cee8cd41a32597512260ac3648e528101</w:t>
+        <w:br/>
+        <w:br/>
+        <w:t>install published v1.2.5            -&gt; Success</w:t>
+        <w:br/>
+        <w:t>install local build OVER it         -&gt; Success</w:t>
+      </w:r>
+    </w:p>
+    <w:p>
+      <w:r>
+        <w:t>The last line is the property that was broken: cross-source, in-place upgrade now works.</w:t>
+      </w:r>
+    </w:p>
+    <w:p>
+      <w:r>
+        <w:t>One-off cost: any build already installed from the throwaway-key releases needs a single</w:t>
+      </w:r>
+    </w:p>
+    <w:p>
+      <w:r>
+        <w:t>uninstall to reach this lineage.</w:t>
+      </w:r>
+    </w:p>
+    <w:p>
+      <w:pPr>
+        <w:pStyle w:val="Heading2"/>
+      </w:pPr>
+      <w:r>
+        <w:t>15.5 The generalisable lesson</w:t>
+      </w:r>
+    </w:p>
+    <w:p>
+      <w:r>
+        <w:t>Every round in this document found its best defect in the mechanism the previous round did not</w:t>
+      </w:r>
+    </w:p>
+    <w:p>
+      <w:r>
+        <w:t>use (§14.3), and this round extends the pattern to the last step of the pipeline: **building,</w:t>
+      </w:r>
+    </w:p>
+    <w:p>
+      <w:r>
+        <w:t>signing and publishing are not the same as shipping.** A release artifact has properties —</w:t>
+      </w:r>
+    </w:p>
+    <w:p>
+      <w:r>
+        <w:t>signature, upgrade path, installability — that exist only when it is installed over an existing</w:t>
+      </w:r>
+    </w:p>
+    <w:p>
+      <w:r>
+        <w:t>one, and none of the four earlier mechanisms ever did that.</w:t>
       </w:r>
     </w:p>
     <w:sectPr>

</xml_diff>